<commit_message>
Align A4 dictation blanks with exam-style pinyin grid.
Use three-column cells so each pinyin sits over a wide writing line; enlarge fonts and margins for primary handwriting.

Co-authored-by: Cursor <cursoragent@cursor.com>
</commit_message>
<xml_diff>
--- a/printables/lessons/L01-观潮-每日10分钟.docx
+++ b/printables/lessons/L01-观潮-每日10分钟.docx
@@ -4,7 +4,7 @@
   <w:body>
     <w:p>
       <w:pPr>
-        <w:spacing w:before="0" w:after="20" w:line="252" w:lineRule="auto"/>
+        <w:spacing w:before="0" w:after="40" w:line="288" w:lineRule="auto"/>
         <w:jc w:val="center"/>
       </w:pPr>
       <w:r>
@@ -12,14 +12,14 @@
           <w:rFonts w:ascii="宋体" w:hAnsi="宋体" w:eastAsia="宋体"/>
           <w:b/>
           <w:color w:val="F4A261"/>
-          <w:sz w:val="18"/>
+          <w:sz w:val="20"/>
         </w:rPr>
         <w:t>语文书桌 · Chinese Desk</w:t>
       </w:r>
     </w:p>
     <w:p>
       <w:pPr>
-        <w:spacing w:before="0" w:after="20" w:line="252" w:lineRule="auto"/>
+        <w:spacing w:before="0" w:after="40" w:line="288" w:lineRule="auto"/>
         <w:jc w:val="center"/>
       </w:pPr>
       <w:r>
@@ -27,14 +27,14 @@
           <w:rFonts w:ascii="宋体" w:hAnsi="宋体" w:eastAsia="宋体"/>
           <w:b/>
           <w:color w:val="E85D04"/>
-          <w:sz w:val="28"/>
+          <w:sz w:val="32"/>
         </w:rPr>
         <w:t>第1课《观潮》· 每日练习（约10分钟）</w:t>
       </w:r>
     </w:p>
     <w:p>
       <w:pPr>
-        <w:spacing w:before="0" w:after="80" w:line="252" w:lineRule="auto"/>
+        <w:spacing w:before="0" w:after="160" w:line="288" w:lineRule="auto"/>
         <w:jc w:val="center"/>
       </w:pPr>
       <w:r>
@@ -42,42 +42,525 @@
           <w:rFonts w:ascii="宋体" w:hAnsi="宋体" w:eastAsia="宋体"/>
           <w:b w:val="0"/>
           <w:color w:val="1C1917"/>
-          <w:sz w:val="18"/>
+          <w:sz w:val="22"/>
         </w:rPr>
         <w:t>第一单元　|　A4　|　姓名：________　日期：________　用时：____分钟</w:t>
       </w:r>
     </w:p>
     <w:p>
       <w:pPr>
-        <w:spacing w:before="100" w:after="60" w:line="252" w:lineRule="auto"/>
+        <w:spacing w:before="160" w:after="160" w:line="288" w:lineRule="auto"/>
       </w:pPr>
       <w:r>
         <w:rPr>
           <w:rFonts w:ascii="宋体" w:hAnsi="宋体" w:eastAsia="宋体"/>
           <w:b/>
           <w:color w:val="E85D04"/>
-          <w:sz w:val="22"/>
+          <w:sz w:val="24"/>
         </w:rPr>
         <w:t>一、字词听写（看拼音写字词）</w:t>
       </w:r>
     </w:p>
+    <w:tbl>
+      <w:tblPr>
+        <w:tblW w:type="auto" w:w="0"/>
+        <w:jc w:val="center"/>
+        <w:tblLayout w:type="fixed"/>
+        <w:tblLook w:firstColumn="1" w:firstRow="1" w:lastColumn="0" w:lastRow="0" w:noHBand="0" w:noVBand="1" w:val="04A0"/>
+        <w:tblBorders>
+          <w:top w:val="nil"/>
+          <w:left w:val="nil"/>
+          <w:bottom w:val="nil"/>
+          <w:right w:val="nil"/>
+          <w:insideH w:val="nil"/>
+          <w:insideV w:val="nil"/>
+        </w:tblBorders>
+      </w:tblPr>
+      <w:tblGrid>
+        <w:gridCol w:w="3289"/>
+        <w:gridCol w:w="3289"/>
+        <w:gridCol w:w="3289"/>
+      </w:tblGrid>
+      <w:tr>
+        <w:tc>
+          <w:tcPr>
+            <w:tcW w:type="dxa" w:w="3250"/>
+            <w:tcBorders/>
+          </w:tcPr>
+          <w:p>
+            <w:pPr>
+              <w:spacing w:before="40" w:after="120" w:line="240" w:lineRule="auto"/>
+              <w:jc w:val="center"/>
+            </w:pPr>
+            <w:r/>
+            <w:r>
+              <w:rPr>
+                <w:rFonts w:ascii="Times New Roman" w:hAnsi="Times New Roman" w:eastAsia="宋体"/>
+                <w:b w:val="0"/>
+                <w:color w:val="1C1917"/>
+                <w:sz w:val="28"/>
+              </w:rPr>
+              <w:t>cháo xī</w:t>
+            </w:r>
+          </w:p>
+          <w:p>
+            <w:pPr>
+              <w:spacing w:before="0" w:after="80"/>
+              <w:jc w:val="center"/>
+              <w:pBdr>
+                <w:bottom w:val="single" w:sz="18" w:space="10" w:color="000000"/>
+              </w:pBdr>
+            </w:pPr>
+            <w:r>
+              <w:rPr>
+                <w:rFonts w:ascii="宋体" w:hAnsi="宋体" w:eastAsia="宋体"/>
+                <w:b w:val="0"/>
+                <w:color w:val="1C1917"/>
+                <w:sz w:val="32"/>
+              </w:rPr>
+              <w:t xml:space="preserve">　　　　　</w:t>
+            </w:r>
+          </w:p>
+        </w:tc>
+        <w:tc>
+          <w:tcPr>
+            <w:tcW w:type="dxa" w:w="3250"/>
+            <w:tcBorders/>
+          </w:tcPr>
+          <w:p>
+            <w:pPr>
+              <w:spacing w:before="40" w:after="120" w:line="240" w:lineRule="auto"/>
+              <w:jc w:val="center"/>
+            </w:pPr>
+            <w:r/>
+            <w:r>
+              <w:rPr>
+                <w:rFonts w:ascii="Times New Roman" w:hAnsi="Times New Roman" w:eastAsia="宋体"/>
+                <w:b w:val="0"/>
+                <w:color w:val="1C1917"/>
+                <w:sz w:val="28"/>
+              </w:rPr>
+              <w:t>jù shuō</w:t>
+            </w:r>
+          </w:p>
+          <w:p>
+            <w:pPr>
+              <w:spacing w:before="0" w:after="80"/>
+              <w:jc w:val="center"/>
+              <w:pBdr>
+                <w:bottom w:val="single" w:sz="18" w:space="10" w:color="000000"/>
+              </w:pBdr>
+            </w:pPr>
+            <w:r>
+              <w:rPr>
+                <w:rFonts w:ascii="宋体" w:hAnsi="宋体" w:eastAsia="宋体"/>
+                <w:b w:val="0"/>
+                <w:color w:val="1C1917"/>
+                <w:sz w:val="32"/>
+              </w:rPr>
+              <w:t xml:space="preserve">　　　　　</w:t>
+            </w:r>
+          </w:p>
+        </w:tc>
+        <w:tc>
+          <w:tcPr>
+            <w:tcW w:type="dxa" w:w="3250"/>
+            <w:tcBorders/>
+          </w:tcPr>
+          <w:p>
+            <w:pPr>
+              <w:spacing w:before="40" w:after="120" w:line="240" w:lineRule="auto"/>
+              <w:jc w:val="center"/>
+            </w:pPr>
+            <w:r/>
+            <w:r>
+              <w:rPr>
+                <w:rFonts w:ascii="Times New Roman" w:hAnsi="Times New Roman" w:eastAsia="宋体"/>
+                <w:b w:val="0"/>
+                <w:color w:val="1C1917"/>
+                <w:sz w:val="28"/>
+              </w:rPr>
+              <w:t>dà dī</w:t>
+            </w:r>
+          </w:p>
+          <w:p>
+            <w:pPr>
+              <w:spacing w:before="0" w:after="80"/>
+              <w:jc w:val="center"/>
+              <w:pBdr>
+                <w:bottom w:val="single" w:sz="18" w:space="10" w:color="000000"/>
+              </w:pBdr>
+            </w:pPr>
+            <w:r>
+              <w:rPr>
+                <w:rFonts w:ascii="宋体" w:hAnsi="宋体" w:eastAsia="宋体"/>
+                <w:b w:val="0"/>
+                <w:color w:val="1C1917"/>
+                <w:sz w:val="32"/>
+              </w:rPr>
+              <w:t xml:space="preserve">　　　　　</w:t>
+            </w:r>
+          </w:p>
+        </w:tc>
+      </w:tr>
+    </w:tbl>
     <w:p>
       <w:pPr>
-        <w:spacing w:before="0" w:after="20" w:line="252" w:lineRule="auto"/>
+        <w:spacing w:before="0" w:after="240"/>
+      </w:pPr>
+    </w:p>
+    <w:tbl>
+      <w:tblPr>
+        <w:tblW w:type="auto" w:w="0"/>
+        <w:jc w:val="center"/>
+        <w:tblLayout w:type="fixed"/>
+        <w:tblLook w:firstColumn="1" w:firstRow="1" w:lastColumn="0" w:lastRow="0" w:noHBand="0" w:noVBand="1" w:val="04A0"/>
+        <w:tblBorders>
+          <w:top w:val="nil"/>
+          <w:left w:val="nil"/>
+          <w:bottom w:val="nil"/>
+          <w:right w:val="nil"/>
+          <w:insideH w:val="nil"/>
+          <w:insideV w:val="nil"/>
+        </w:tblBorders>
+      </w:tblPr>
+      <w:tblGrid>
+        <w:gridCol w:w="3289"/>
+        <w:gridCol w:w="3289"/>
+        <w:gridCol w:w="3289"/>
+      </w:tblGrid>
+      <w:tr>
+        <w:tc>
+          <w:tcPr>
+            <w:tcW w:type="dxa" w:w="3250"/>
+            <w:tcBorders/>
+          </w:tcPr>
+          <w:p>
+            <w:pPr>
+              <w:spacing w:before="40" w:after="120" w:line="240" w:lineRule="auto"/>
+              <w:jc w:val="center"/>
+            </w:pPr>
+            <w:r/>
+            <w:r>
+              <w:rPr>
+                <w:rFonts w:ascii="Times New Roman" w:hAnsi="Times New Roman" w:eastAsia="宋体"/>
+                <w:b w:val="0"/>
+                <w:color w:val="1C1917"/>
+                <w:sz w:val="28"/>
+              </w:rPr>
+              <w:t>pàn wàng</w:t>
+            </w:r>
+          </w:p>
+          <w:p>
+            <w:pPr>
+              <w:spacing w:before="0" w:after="80"/>
+              <w:jc w:val="center"/>
+              <w:pBdr>
+                <w:bottom w:val="single" w:sz="18" w:space="10" w:color="000000"/>
+              </w:pBdr>
+            </w:pPr>
+            <w:r>
+              <w:rPr>
+                <w:rFonts w:ascii="宋体" w:hAnsi="宋体" w:eastAsia="宋体"/>
+                <w:b w:val="0"/>
+                <w:color w:val="1C1917"/>
+                <w:sz w:val="32"/>
+              </w:rPr>
+              <w:t xml:space="preserve">　　　　　</w:t>
+            </w:r>
+          </w:p>
+        </w:tc>
+        <w:tc>
+          <w:tcPr>
+            <w:tcW w:type="dxa" w:w="3250"/>
+            <w:tcBorders/>
+          </w:tcPr>
+          <w:p>
+            <w:pPr>
+              <w:spacing w:before="40" w:after="120" w:line="240" w:lineRule="auto"/>
+              <w:jc w:val="center"/>
+            </w:pPr>
+            <w:r/>
+            <w:r>
+              <w:rPr>
+                <w:rFonts w:ascii="Times New Roman" w:hAnsi="Times New Roman" w:eastAsia="宋体"/>
+                <w:b w:val="0"/>
+                <w:color w:val="1C1917"/>
+                <w:sz w:val="28"/>
+              </w:rPr>
+              <w:t>zhú jiàn</w:t>
+            </w:r>
+          </w:p>
+          <w:p>
+            <w:pPr>
+              <w:spacing w:before="0" w:after="80"/>
+              <w:jc w:val="center"/>
+              <w:pBdr>
+                <w:bottom w:val="single" w:sz="18" w:space="10" w:color="000000"/>
+              </w:pBdr>
+            </w:pPr>
+            <w:r>
+              <w:rPr>
+                <w:rFonts w:ascii="宋体" w:hAnsi="宋体" w:eastAsia="宋体"/>
+                <w:b w:val="0"/>
+                <w:color w:val="1C1917"/>
+                <w:sz w:val="32"/>
+              </w:rPr>
+              <w:t xml:space="preserve">　　　　　</w:t>
+            </w:r>
+          </w:p>
+        </w:tc>
+        <w:tc>
+          <w:tcPr>
+            <w:tcW w:type="dxa" w:w="3250"/>
+            <w:tcBorders/>
+          </w:tcPr>
+          <w:p>
+            <w:pPr>
+              <w:spacing w:before="40" w:after="120" w:line="240" w:lineRule="auto"/>
+              <w:jc w:val="center"/>
+            </w:pPr>
+            <w:r/>
+            <w:r>
+              <w:rPr>
+                <w:rFonts w:ascii="Times New Roman" w:hAnsi="Times New Roman" w:eastAsia="宋体"/>
+                <w:b w:val="0"/>
+                <w:color w:val="1C1917"/>
+                <w:sz w:val="28"/>
+              </w:rPr>
+              <w:t>shà shí</w:t>
+            </w:r>
+          </w:p>
+          <w:p>
+            <w:pPr>
+              <w:spacing w:before="0" w:after="80"/>
+              <w:jc w:val="center"/>
+              <w:pBdr>
+                <w:bottom w:val="single" w:sz="18" w:space="10" w:color="000000"/>
+              </w:pBdr>
+            </w:pPr>
+            <w:r>
+              <w:rPr>
+                <w:rFonts w:ascii="宋体" w:hAnsi="宋体" w:eastAsia="宋体"/>
+                <w:b w:val="0"/>
+                <w:color w:val="1C1917"/>
+                <w:sz w:val="32"/>
+              </w:rPr>
+              <w:t xml:space="preserve">　　　　　</w:t>
+            </w:r>
+          </w:p>
+        </w:tc>
+      </w:tr>
+    </w:tbl>
+    <w:p>
+      <w:pPr>
+        <w:spacing w:before="0" w:after="240"/>
+      </w:pPr>
+    </w:p>
+    <w:p>
+      <w:pPr>
+        <w:spacing w:before="160" w:after="160" w:line="288" w:lineRule="auto"/>
       </w:pPr>
       <w:r>
         <w:rPr>
           <w:rFonts w:ascii="宋体" w:hAnsi="宋体" w:eastAsia="宋体"/>
-          <w:b w:val="0"/>
-          <w:color w:val="1C1917"/>
-          <w:sz w:val="20"/>
+          <w:b/>
+          <w:color w:val="E85D04"/>
+          <w:sz w:val="24"/>
         </w:rPr>
-        <w:t>cháo xī　　jù shuō　　dà dī</w:t>
+        <w:t>二、成语练习（看拼音写 + 选词填空）</w:t>
       </w:r>
+    </w:p>
+    <w:tbl>
+      <w:tblPr>
+        <w:tblW w:type="auto" w:w="0"/>
+        <w:jc w:val="center"/>
+        <w:tblLayout w:type="fixed"/>
+        <w:tblLook w:firstColumn="1" w:firstRow="1" w:lastColumn="0" w:lastRow="0" w:noHBand="0" w:noVBand="1" w:val="04A0"/>
+        <w:tblBorders>
+          <w:top w:val="nil"/>
+          <w:left w:val="nil"/>
+          <w:bottom w:val="nil"/>
+          <w:right w:val="nil"/>
+          <w:insideH w:val="nil"/>
+          <w:insideV w:val="nil"/>
+        </w:tblBorders>
+      </w:tblPr>
+      <w:tblGrid>
+        <w:gridCol w:w="4933"/>
+        <w:gridCol w:w="4933"/>
+      </w:tblGrid>
+      <w:tr>
+        <w:tc>
+          <w:tcPr>
+            <w:tcW w:type="dxa" w:w="4876"/>
+            <w:tcBorders/>
+          </w:tcPr>
+          <w:p>
+            <w:pPr>
+              <w:spacing w:before="40" w:after="120" w:line="240" w:lineRule="auto"/>
+              <w:jc w:val="center"/>
+            </w:pPr>
+            <w:r/>
+            <w:r>
+              <w:rPr>
+                <w:rFonts w:ascii="Times New Roman" w:hAnsi="Times New Roman" w:eastAsia="宋体"/>
+                <w:b w:val="0"/>
+                <w:color w:val="1C1917"/>
+                <w:sz w:val="28"/>
+              </w:rPr>
+              <w:t>hào hào dàng dàng</w:t>
+            </w:r>
+          </w:p>
+          <w:p>
+            <w:pPr>
+              <w:spacing w:before="0" w:after="80"/>
+              <w:jc w:val="center"/>
+              <w:pBdr>
+                <w:bottom w:val="single" w:sz="18" w:space="10" w:color="000000"/>
+              </w:pBdr>
+            </w:pPr>
+            <w:r>
+              <w:rPr>
+                <w:rFonts w:ascii="宋体" w:hAnsi="宋体" w:eastAsia="宋体"/>
+                <w:b w:val="0"/>
+                <w:color w:val="1C1917"/>
+                <w:sz w:val="32"/>
+              </w:rPr>
+              <w:t xml:space="preserve">　　　　　　　</w:t>
+            </w:r>
+          </w:p>
+        </w:tc>
+        <w:tc>
+          <w:tcPr>
+            <w:tcW w:type="dxa" w:w="4876"/>
+            <w:tcBorders/>
+          </w:tcPr>
+          <w:p>
+            <w:pPr>
+              <w:spacing w:before="40" w:after="120" w:line="240" w:lineRule="auto"/>
+              <w:jc w:val="center"/>
+            </w:pPr>
+            <w:r/>
+            <w:r>
+              <w:rPr>
+                <w:rFonts w:ascii="Times New Roman" w:hAnsi="Times New Roman" w:eastAsia="宋体"/>
+                <w:b w:val="0"/>
+                <w:color w:val="1C1917"/>
+                <w:sz w:val="28"/>
+              </w:rPr>
+              <w:t>shān bēng dì liè</w:t>
+            </w:r>
+          </w:p>
+          <w:p>
+            <w:pPr>
+              <w:spacing w:before="0" w:after="80"/>
+              <w:jc w:val="center"/>
+              <w:pBdr>
+                <w:bottom w:val="single" w:sz="18" w:space="10" w:color="000000"/>
+              </w:pBdr>
+            </w:pPr>
+            <w:r>
+              <w:rPr>
+                <w:rFonts w:ascii="宋体" w:hAnsi="宋体" w:eastAsia="宋体"/>
+                <w:b w:val="0"/>
+                <w:color w:val="1C1917"/>
+                <w:sz w:val="32"/>
+              </w:rPr>
+              <w:t xml:space="preserve">　　　　　　　</w:t>
+            </w:r>
+          </w:p>
+        </w:tc>
+      </w:tr>
+    </w:tbl>
+    <w:p>
+      <w:pPr>
+        <w:spacing w:before="0" w:after="240"/>
+      </w:pPr>
+    </w:p>
+    <w:tbl>
+      <w:tblPr>
+        <w:tblW w:type="auto" w:w="0"/>
+        <w:jc w:val="center"/>
+        <w:tblLayout w:type="fixed"/>
+        <w:tblLook w:firstColumn="1" w:firstRow="1" w:lastColumn="0" w:lastRow="0" w:noHBand="0" w:noVBand="1" w:val="04A0"/>
+        <w:tblBorders>
+          <w:top w:val="nil"/>
+          <w:left w:val="nil"/>
+          <w:bottom w:val="nil"/>
+          <w:right w:val="nil"/>
+          <w:insideH w:val="nil"/>
+          <w:insideV w:val="nil"/>
+        </w:tblBorders>
+      </w:tblPr>
+      <w:tblGrid>
+        <w:gridCol w:w="4933"/>
+        <w:gridCol w:w="4933"/>
+      </w:tblGrid>
+      <w:tr>
+        <w:tc>
+          <w:tcPr>
+            <w:tcW w:type="dxa" w:w="4876"/>
+            <w:tcBorders/>
+          </w:tcPr>
+          <w:p>
+            <w:pPr>
+              <w:spacing w:before="40" w:after="120" w:line="240" w:lineRule="auto"/>
+              <w:jc w:val="center"/>
+            </w:pPr>
+            <w:r/>
+            <w:r>
+              <w:rPr>
+                <w:rFonts w:ascii="Times New Roman" w:hAnsi="Times New Roman" w:eastAsia="宋体"/>
+                <w:b w:val="0"/>
+                <w:color w:val="1C1917"/>
+                <w:sz w:val="28"/>
+              </w:rPr>
+              <w:t>qí tóu bìng jìn</w:t>
+            </w:r>
+          </w:p>
+          <w:p>
+            <w:pPr>
+              <w:spacing w:before="0" w:after="80"/>
+              <w:jc w:val="center"/>
+              <w:pBdr>
+                <w:bottom w:val="single" w:sz="18" w:space="10" w:color="000000"/>
+              </w:pBdr>
+            </w:pPr>
+            <w:r>
+              <w:rPr>
+                <w:rFonts w:ascii="宋体" w:hAnsi="宋体" w:eastAsia="宋体"/>
+                <w:b w:val="0"/>
+                <w:color w:val="1C1917"/>
+                <w:sz w:val="32"/>
+              </w:rPr>
+              <w:t xml:space="preserve">　　　　　　　</w:t>
+            </w:r>
+          </w:p>
+        </w:tc>
+        <w:tc>
+          <w:tcPr>
+            <w:tcW w:type="dxa" w:w="4876"/>
+            <w:tcBorders/>
+          </w:tcPr>
+          <w:p>
+            <w:pPr>
+              <w:spacing w:before="40" w:after="120" w:line="240" w:lineRule="auto"/>
+              <w:jc w:val="center"/>
+            </w:pPr>
+            <w:r/>
+          </w:p>
+        </w:tc>
+      </w:tr>
+    </w:tbl>
+    <w:p>
+      <w:pPr>
+        <w:spacing w:before="0" w:after="240"/>
+      </w:pPr>
     </w:p>
     <w:p>
       <w:pPr>
-        <w:spacing w:before="0" w:after="100" w:line="252" w:lineRule="auto"/>
+        <w:spacing w:before="0" w:after="80" w:line="288" w:lineRule="auto"/>
       </w:pPr>
       <w:r>
         <w:rPr>
@@ -86,26 +569,26 @@
           <w:color w:val="1C1917"/>
           <w:sz w:val="24"/>
         </w:rPr>
-        <w:t>________　　________　　________</w:t>
+        <w:t>选一个成语造句：</w:t>
       </w:r>
     </w:p>
     <w:p>
       <w:pPr>
-        <w:spacing w:before="0" w:after="20" w:line="252" w:lineRule="auto"/>
+        <w:spacing w:before="0" w:after="200" w:line="288" w:lineRule="auto"/>
       </w:pPr>
       <w:r>
         <w:rPr>
           <w:rFonts w:ascii="宋体" w:hAnsi="宋体" w:eastAsia="宋体"/>
           <w:b w:val="0"/>
           <w:color w:val="1C1917"/>
-          <w:sz w:val="20"/>
+          <w:sz w:val="28"/>
         </w:rPr>
-        <w:t>pàn wàng　　zhú jiàn　　shà shí</w:t>
+        <w:t>＿＿＿＿＿＿＿＿＿＿＿＿＿＿＿＿＿＿＿＿＿＿＿＿＿＿＿＿＿＿</w:t>
       </w:r>
     </w:p>
     <w:p>
       <w:pPr>
-        <w:spacing w:before="0" w:after="100" w:line="252" w:lineRule="auto"/>
+        <w:spacing w:before="0" w:after="160" w:line="288" w:lineRule="auto"/>
       </w:pPr>
       <w:r>
         <w:rPr>
@@ -114,250 +597,110 @@
           <w:color w:val="1C1917"/>
           <w:sz w:val="24"/>
         </w:rPr>
-        <w:t>________　　________　　________</w:t>
+        <w:t>形近组词：潮（　　）朝（　　）　堤（　　）提（　　）　盼（　　）扮（　　）</w:t>
       </w:r>
     </w:p>
     <w:p>
       <w:pPr>
-        <w:spacing w:before="100" w:after="60" w:line="252" w:lineRule="auto"/>
+        <w:spacing w:before="160" w:after="160" w:line="288" w:lineRule="auto"/>
       </w:pPr>
       <w:r>
         <w:rPr>
           <w:rFonts w:ascii="宋体" w:hAnsi="宋体" w:eastAsia="宋体"/>
           <w:b/>
           <w:color w:val="E85D04"/>
-          <w:sz w:val="22"/>
+          <w:sz w:val="24"/>
         </w:rPr>
-        <w:t>二、成语练习（看拼音写 + 选词填空）</w:t>
+        <w:t>三、多音字辨认（参考单元测题型）</w:t>
       </w:r>
     </w:p>
     <w:p>
       <w:pPr>
-        <w:spacing w:before="0" w:after="80" w:line="252" w:lineRule="auto"/>
+        <w:spacing w:before="0" w:after="120" w:line="288" w:lineRule="auto"/>
+      </w:pPr>
+      <w:r>
+        <w:rPr>
+          <w:rFonts w:ascii="宋体" w:hAnsi="宋体" w:eastAsia="宋体"/>
+          <w:b w:val="0"/>
+          <w:color w:val="C2410C"/>
+          <w:sz w:val="22"/>
+        </w:rPr>
+        <w:t>在正确读音下面画“√”。</w:t>
+      </w:r>
+    </w:p>
+    <w:p>
+      <w:pPr>
+        <w:spacing w:before="0" w:after="160" w:line="288" w:lineRule="auto"/>
       </w:pPr>
       <w:r>
         <w:rPr>
           <w:rFonts w:ascii="宋体" w:hAnsi="宋体" w:eastAsia="宋体"/>
           <w:b w:val="0"/>
           <w:color w:val="1C1917"/>
-          <w:sz w:val="21"/>
+          <w:sz w:val="28"/>
         </w:rPr>
-        <w:t>hào hào dàng dàng　____________________</w:t>
+        <w:t>观潮　（cháo　zhāo）</w:t>
       </w:r>
     </w:p>
     <w:p>
       <w:pPr>
-        <w:spacing w:before="0" w:after="80" w:line="252" w:lineRule="auto"/>
+        <w:spacing w:before="0" w:after="160" w:line="288" w:lineRule="auto"/>
       </w:pPr>
       <w:r>
         <w:rPr>
           <w:rFonts w:ascii="宋体" w:hAnsi="宋体" w:eastAsia="宋体"/>
           <w:b w:val="0"/>
           <w:color w:val="1C1917"/>
-          <w:sz w:val="21"/>
+          <w:sz w:val="28"/>
         </w:rPr>
-        <w:t>shān bēng dì liè　____________________</w:t>
+        <w:t>朝阳　（cháo　zhāo）</w:t>
       </w:r>
     </w:p>
     <w:p>
       <w:pPr>
-        <w:spacing w:before="0" w:after="80" w:line="252" w:lineRule="auto"/>
+        <w:spacing w:before="0" w:after="160" w:line="288" w:lineRule="auto"/>
       </w:pPr>
       <w:r>
         <w:rPr>
           <w:rFonts w:ascii="宋体" w:hAnsi="宋体" w:eastAsia="宋体"/>
           <w:b w:val="0"/>
           <w:color w:val="1C1917"/>
-          <w:sz w:val="21"/>
+          <w:sz w:val="28"/>
         </w:rPr>
-        <w:t>qí tóu bìng jìn　____________________</w:t>
+        <w:t>闷雷　（mēn　mèn）</w:t>
       </w:r>
     </w:p>
     <w:p>
       <w:pPr>
-        <w:spacing w:before="0" w:after="100" w:line="252" w:lineRule="auto"/>
+        <w:spacing w:before="0" w:after="160" w:line="288" w:lineRule="auto"/>
       </w:pPr>
       <w:r>
         <w:rPr>
           <w:rFonts w:ascii="宋体" w:hAnsi="宋体" w:eastAsia="宋体"/>
           <w:b w:val="0"/>
           <w:color w:val="1C1917"/>
-          <w:sz w:val="21"/>
+          <w:sz w:val="28"/>
         </w:rPr>
-        <w:t>选一个成语造句：________________________________________________</w:t>
+        <w:t>霎时　（shà　chà）</w:t>
       </w:r>
     </w:p>
     <w:p>
       <w:pPr>
-        <w:spacing w:before="0" w:after="100" w:line="252" w:lineRule="auto"/>
-      </w:pPr>
-      <w:r>
-        <w:rPr>
-          <w:rFonts w:ascii="宋体" w:hAnsi="宋体" w:eastAsia="宋体"/>
-          <w:b w:val="0"/>
-          <w:color w:val="1C1917"/>
-          <w:sz w:val="21"/>
-        </w:rPr>
-        <w:t>形近组词：潮（　　）朝（　　）　堤（　　）提（　　）　盼（　　）扮（　　）</w:t>
-      </w:r>
-    </w:p>
-    <w:p>
-      <w:pPr>
-        <w:spacing w:before="100" w:after="60" w:line="252" w:lineRule="auto"/>
-      </w:pPr>
-      <w:r>
-        <w:rPr>
-          <w:rFonts w:ascii="宋体" w:hAnsi="宋体" w:eastAsia="宋体"/>
-          <w:b/>
-          <w:color w:val="E85D04"/>
-          <w:sz w:val="22"/>
-        </w:rPr>
-        <w:t>三、多音字辨认（参考单元测题型）</w:t>
-      </w:r>
-    </w:p>
-    <w:p>
-      <w:pPr>
-        <w:spacing w:before="0" w:after="60" w:line="252" w:lineRule="auto"/>
+        <w:spacing w:before="0" w:after="120" w:line="288" w:lineRule="auto"/>
       </w:pPr>
       <w:r>
         <w:rPr>
           <w:rFonts w:ascii="宋体" w:hAnsi="宋体" w:eastAsia="宋体"/>
           <w:b w:val="0"/>
           <w:color w:val="C2410C"/>
-          <w:sz w:val="18"/>
-        </w:rPr>
-        <w:t>在正确读音下面画“√”。</w:t>
-      </w:r>
-    </w:p>
-    <w:p>
-      <w:pPr>
-        <w:spacing w:before="0" w:after="80" w:line="252" w:lineRule="auto"/>
-      </w:pPr>
-      <w:r>
-        <w:rPr>
-          <w:rFonts w:ascii="宋体" w:hAnsi="宋体" w:eastAsia="宋体"/>
-          <w:b w:val="0"/>
-          <w:color w:val="1C1917"/>
           <w:sz w:val="22"/>
-        </w:rPr>
-        <w:t>观潮　（cháo　zhāo）</w:t>
-      </w:r>
-    </w:p>
-    <w:p>
-      <w:pPr>
-        <w:spacing w:before="0" w:after="80" w:line="252" w:lineRule="auto"/>
-      </w:pPr>
-      <w:r>
-        <w:rPr>
-          <w:rFonts w:ascii="宋体" w:hAnsi="宋体" w:eastAsia="宋体"/>
-          <w:b w:val="0"/>
-          <w:color w:val="1C1917"/>
-          <w:sz w:val="22"/>
-        </w:rPr>
-        <w:t>朝阳　（cháo　zhāo）</w:t>
-      </w:r>
-    </w:p>
-    <w:p>
-      <w:pPr>
-        <w:spacing w:before="0" w:after="80" w:line="252" w:lineRule="auto"/>
-      </w:pPr>
-      <w:r>
-        <w:rPr>
-          <w:rFonts w:ascii="宋体" w:hAnsi="宋体" w:eastAsia="宋体"/>
-          <w:b w:val="0"/>
-          <w:color w:val="1C1917"/>
-          <w:sz w:val="22"/>
-        </w:rPr>
-        <w:t>闷雷　（mēn　mèn）</w:t>
-      </w:r>
-    </w:p>
-    <w:p>
-      <w:pPr>
-        <w:spacing w:before="0" w:after="80" w:line="252" w:lineRule="auto"/>
-      </w:pPr>
-      <w:r>
-        <w:rPr>
-          <w:rFonts w:ascii="宋体" w:hAnsi="宋体" w:eastAsia="宋体"/>
-          <w:b w:val="0"/>
-          <w:color w:val="1C1917"/>
-          <w:sz w:val="22"/>
-        </w:rPr>
-        <w:t>霎时　（shà　chà）</w:t>
-      </w:r>
-    </w:p>
-    <w:p>
-      <w:pPr>
-        <w:spacing w:before="0" w:after="60" w:line="252" w:lineRule="auto"/>
-      </w:pPr>
-      <w:r>
-        <w:rPr>
-          <w:rFonts w:ascii="宋体" w:hAnsi="宋体" w:eastAsia="宋体"/>
-          <w:b w:val="0"/>
-          <w:color w:val="C2410C"/>
-          <w:sz w:val="18"/>
         </w:rPr>
         <w:t>选出读音有误的一项，把错的字音改正：</w:t>
       </w:r>
     </w:p>
     <w:p>
       <w:pPr>
-        <w:spacing w:before="0" w:after="100" w:line="252" w:lineRule="auto"/>
-      </w:pPr>
-      <w:r>
-        <w:rPr>
-          <w:rFonts w:ascii="宋体" w:hAnsi="宋体" w:eastAsia="宋体"/>
-          <w:b w:val="0"/>
-          <w:color w:val="1C1917"/>
-          <w:sz w:val="21"/>
-        </w:rPr>
-        <w:t>1.薄雾（bó）　2.萤火虫（yín）　3.芦苇（wěi）　　有误：第____项，应读________</w:t>
-      </w:r>
-    </w:p>
-    <w:p>
-      <w:pPr>
-        <w:spacing w:before="100" w:after="60" w:line="252" w:lineRule="auto"/>
-      </w:pPr>
-      <w:r>
-        <w:rPr>
-          <w:rFonts w:ascii="宋体" w:hAnsi="宋体" w:eastAsia="宋体"/>
-          <w:b/>
-          <w:color w:val="E85D04"/>
-          <w:sz w:val="22"/>
-        </w:rPr>
-        <w:t>四、句型仿写</w:t>
-      </w:r>
-    </w:p>
-    <w:p>
-      <w:pPr>
-        <w:spacing w:before="0" w:after="40" w:line="252" w:lineRule="auto"/>
-      </w:pPr>
-      <w:r>
-        <w:rPr>
-          <w:rFonts w:ascii="宋体" w:hAnsi="宋体" w:eastAsia="宋体"/>
-          <w:b w:val="0"/>
-          <w:color w:val="1C1917"/>
-          <w:sz w:val="21"/>
-        </w:rPr>
-        <w:t>用上「霎时／顿时／过了一会儿」写潮来或下雨（2～3 句）</w:t>
-      </w:r>
-    </w:p>
-    <w:p>
-      <w:pPr>
-        <w:spacing w:before="0" w:after="60" w:line="252" w:lineRule="auto"/>
-      </w:pPr>
-      <w:r>
-        <w:rPr>
-          <w:rFonts w:ascii="宋体" w:hAnsi="宋体" w:eastAsia="宋体"/>
-          <w:b w:val="0"/>
-          <w:color w:val="C2410C"/>
-          <w:sz w:val="18"/>
-        </w:rPr>
-        <w:t>例：远处出现一条白线，霎时拉长变粗；过了一会儿，浪潮齐头并进。</w:t>
-      </w:r>
-    </w:p>
-    <w:p>
-      <w:pPr>
-        <w:spacing w:before="0" w:after="100" w:line="252" w:lineRule="auto"/>
+        <w:spacing w:before="0" w:after="120" w:line="288" w:lineRule="auto"/>
       </w:pPr>
       <w:r>
         <w:rPr>
@@ -366,12 +709,12 @@
           <w:color w:val="1C1917"/>
           <w:sz w:val="24"/>
         </w:rPr>
-        <w:t>____________________________________________________________</w:t>
+        <w:t>1.薄雾（bó）　2.萤火虫（yín）　3.芦苇（wěi）</w:t>
       </w:r>
     </w:p>
     <w:p>
       <w:pPr>
-        <w:spacing w:before="0" w:after="100" w:line="252" w:lineRule="auto"/>
+        <w:spacing w:before="0" w:after="160" w:line="288" w:lineRule="auto"/>
       </w:pPr>
       <w:r>
         <w:rPr>
@@ -380,26 +723,96 @@
           <w:color w:val="1C1917"/>
           <w:sz w:val="24"/>
         </w:rPr>
-        <w:t>____________________________________________________________</w:t>
+        <w:t>有误：第____项，应读________</w:t>
       </w:r>
     </w:p>
     <w:p>
       <w:pPr>
-        <w:spacing w:before="80" w:after="40" w:line="252" w:lineRule="auto"/>
+        <w:spacing w:before="160" w:after="160" w:line="288" w:lineRule="auto"/>
+      </w:pPr>
+      <w:r>
+        <w:rPr>
+          <w:rFonts w:ascii="宋体" w:hAnsi="宋体" w:eastAsia="宋体"/>
+          <w:b/>
+          <w:color w:val="E85D04"/>
+          <w:sz w:val="24"/>
+        </w:rPr>
+        <w:t>四、句型仿写</w:t>
+      </w:r>
+    </w:p>
+    <w:p>
+      <w:pPr>
+        <w:spacing w:before="0" w:after="80" w:line="288" w:lineRule="auto"/>
+      </w:pPr>
+      <w:r>
+        <w:rPr>
+          <w:rFonts w:ascii="宋体" w:hAnsi="宋体" w:eastAsia="宋体"/>
+          <w:b w:val="0"/>
+          <w:color w:val="1C1917"/>
+          <w:sz w:val="24"/>
+        </w:rPr>
+        <w:t>用上「霎时／顿时／过了一会儿」写潮来或下雨（2～3 句）</w:t>
+      </w:r>
+    </w:p>
+    <w:p>
+      <w:pPr>
+        <w:spacing w:before="0" w:after="120" w:line="288" w:lineRule="auto"/>
       </w:pPr>
       <w:r>
         <w:rPr>
           <w:rFonts w:ascii="宋体" w:hAnsi="宋体" w:eastAsia="宋体"/>
           <w:b w:val="0"/>
           <w:color w:val="C2410C"/>
-          <w:sz w:val="16"/>
+          <w:sz w:val="22"/>
+        </w:rPr>
+        <w:t>例：远处出现一条白线，霎时拉长变粗；过了一会儿，浪潮齐头并进。</w:t>
+      </w:r>
+    </w:p>
+    <w:p>
+      <w:pPr>
+        <w:spacing w:before="0" w:after="200" w:line="288" w:lineRule="auto"/>
+      </w:pPr>
+      <w:r>
+        <w:rPr>
+          <w:rFonts w:ascii="宋体" w:hAnsi="宋体" w:eastAsia="宋体"/>
+          <w:b w:val="0"/>
+          <w:color w:val="1C1917"/>
+          <w:sz w:val="28"/>
+        </w:rPr>
+        <w:t>＿＿＿＿＿＿＿＿＿＿＿＿＿＿＿＿＿＿＿＿＿＿＿＿＿＿＿＿＿＿</w:t>
+      </w:r>
+    </w:p>
+    <w:p>
+      <w:pPr>
+        <w:spacing w:before="0" w:after="200" w:line="288" w:lineRule="auto"/>
+      </w:pPr>
+      <w:r>
+        <w:rPr>
+          <w:rFonts w:ascii="宋体" w:hAnsi="宋体" w:eastAsia="宋体"/>
+          <w:b w:val="0"/>
+          <w:color w:val="1C1917"/>
+          <w:sz w:val="28"/>
+        </w:rPr>
+        <w:t>＿＿＿＿＿＿＿＿＿＿＿＿＿＿＿＿＿＿＿＿＿＿＿＿＿＿＿＿＿＿</w:t>
+      </w:r>
+    </w:p>
+    <w:p>
+      <w:pPr>
+        <w:spacing w:before="120" w:after="60" w:line="288" w:lineRule="auto"/>
+      </w:pPr>
+      <w:r>
+        <w:rPr>
+          <w:rFonts w:ascii="宋体" w:hAnsi="宋体" w:eastAsia="宋体"/>
+          <w:b w:val="0"/>
+          <w:color w:val="C2410C"/>
+          <w:sz w:val="20"/>
         </w:rPr>
         <w:t>□错题记入错题档案　　□已订正</w:t>
       </w:r>
     </w:p>
     <w:p>
       <w:pPr>
-        <w:spacing w:before="80" w:after="40" w:line="252" w:lineRule="auto"/>
+        <w:spacing w:before="120" w:after="60" w:line="288" w:lineRule="auto"/>
         <w:jc w:val="center"/>
       </w:pPr>
       <w:r>
@@ -407,14 +820,14 @@
           <w:rFonts w:ascii="宋体" w:hAnsi="宋体" w:eastAsia="宋体"/>
           <w:b w:val="0"/>
           <w:color w:val="F4A261"/>
-          <w:sz w:val="16"/>
+          <w:sz w:val="18"/>
         </w:rPr>
         <w:t>第1课每日练习 · 约10分钟 · 有背诵另做默写单</w:t>
       </w:r>
     </w:p>
     <w:sectPr>
       <w:pgSz w:w="11906" w:h="16838"/>
-      <w:pgMar w:top="567" w:right="680" w:bottom="567" w:left="680" w:header="720" w:footer="720" w:gutter="0"/>
+      <w:pgMar w:top="850" w:right="1020" w:bottom="850" w:left="1020" w:header="720" w:footer="720" w:gutter="0"/>
       <w:cols w:space="720"/>
       <w:docGrid w:linePitch="360"/>
     </w:sectPr>
@@ -787,7 +1200,7 @@
     <w:rsid w:val="00FC693F"/>
     <w:rPr>
       <w:rFonts w:ascii="宋体" w:hAnsi="宋体" w:eastAsia="宋体"/>
-      <w:sz w:val="21"/>
+      <w:sz w:val="24"/>
     </w:rPr>
   </w:style>
   <w:style w:type="paragraph" w:styleId="Header">

</xml_diff>